<commit_message>
docs(week01): cap nhat thong tin nhom - GV Le Thi Bich Tra, ma lop SE20A07
</commit_message>
<xml_diff>
--- a/Week01/Week01_BaoCaoNhom (2).docx
+++ b/Week01/Week01_BaoCaoNhom (2).docx
@@ -235,7 +235,7 @@
                 <w:b w:val="0"/>
                 <w:sz w:val="19"/>
               </w:rPr>
-              <w:t>FER202 - ReactJS/RBL (cập nhật mã lớp cụ thể nếu giảng viên yêu cầu)</w:t>
+              <w:t>FER202 - SE20A07</w:t>
             </w:r>
           </w:p>
         </w:tc>
@@ -294,7 +294,7 @@
                 <w:b w:val="0"/>
                 <w:sz w:val="19"/>
               </w:rPr>
-              <w:t>Giảng viên môn FER202 (cập nhật tên giảng viên khi nộp bản chính thức)</w:t>
+              <w:t>Lê Thị Bích Tra</w:t>
             </w:r>
           </w:p>
         </w:tc>

</xml_diff>